<commit_message>
Grade 11 Biology: all 10 sub-strands (78 lessons) + quizzes; case-sensitive duplicate check
Co-Authored-By: Claude Opus 5.5 (1M context) <noreply@anthropic.com>
</commit_message>
<xml_diff>
--- a/data/outputs/v2/Grade11/Biology/Quizzes/SS2.1_Reproduction_in_Plants/Biology_G11_SS2.1_Reproduction_in_Plants_L1_AnswerKey.docx
+++ b/data/outputs/v2/Grade11/Biology/Quizzes/SS2.1_Reproduction_in_Plants/Biology_G11_SS2.1_Reproduction_in_Plants_L1_AnswerKey.docx
@@ -1405,7 +1405,7 @@
         </w:rPr>
         <w:t xml:space="preserve">© 2026 SeaVuria and ARES. Aligned with KICD objectives. Developed by SeaVuria; technical implementation by ARES (with AI assistance from Claude). Licensed under </w:t>
       </w:r>
-      <w:hyperlink w:history="1" r:id="rIdxgie902v1liipxyvy7ifd">
+      <w:hyperlink w:history="1" r:id="rIdhpwjr5j6akx8dr7clcnul">
         <w:r>
           <w:rPr>
             <w:rFonts w:ascii="Arial" w:cs="Arial" w:eastAsia="Arial" w:hAnsi="Arial"/>
@@ -1426,7 +1426,7 @@
         </w:rPr>
         <w:t xml:space="preserve"> (</w:t>
       </w:r>
-      <w:hyperlink w:history="1" r:id="rIdweilgk3qhyv0sop26v6lr">
+      <w:hyperlink w:history="1" r:id="rIdqyftxciqrcz1rx4xs0fep">
         <w:r>
           <w:rPr>
             <w:rFonts w:ascii="Arial" w:cs="Arial" w:eastAsia="Arial" w:hAnsi="Arial"/>

</xml_diff>